<commit_message>
Rename defined party term 'Tribe' to 'Lumbee Tribe' across package
- common.py: TRIBE_SHORT now 'Lumbee Tribe'
- Guarded rename in all generators (preserves 'Tribal' adjective, full name,
  and TRIBE_* constants); regenerated all 34 documents
- README + Sources updated; consistency check 12 PASS / 0 WARN / 0 FAIL
- Added finish_workbooks.py (parties-line injection finisher)

Co-Authored-By: Claude Opus 4.8 <noreply@anthropic.com>
Claude-Session: https://claude.ai/code/session_01NhaKeVxjNyTBn6poC6zJrZ
</commit_message>
<xml_diff>
--- a/Lumbee_RIVR_Tech_IRU_Package/01_Executive/Lumbee_RIVR_Executive_Deal_Summary_and_Term_Sheet.docx
+++ b/Lumbee_RIVR_Tech_IRU_Package/01_Executive/Lumbee_RIVR_Executive_Deal_Summary_and_Term_Sheet.docx
@@ -260,7 +260,7 @@
           <w:b w:val="0"/>
           <w:i/>
         </w:rPr>
-        <w:t>This Executive Deal Summary and Term Sheet (this “Summary”) describes the proposed broadband partnership by and between Lumbee Tribe of North Carolina (the “Tribe”), or a wholly owned Tribal entity or Tribally chartered instrumentality designated by the Tribe, and LREMC Technologies, LLC d/b/a RIVR Tech (“RIVR Tech”). It is a non-binding working draft prepared to frame the transaction, isolate open business issues, and drive the definitive documents. It does not create legal obligations, is not an offer, and is subject in all respects to legal, grant-compliance, and financial review. Defined terms used but not defined here have the meanings given in the definitive agreements.</w:t>
+        <w:t>This Executive Deal Summary and Term Sheet (this “Summary”) describes the proposed broadband partnership by and between Lumbee Tribe of North Carolina (the “Lumbee Tribe”), or a wholly owned Tribal entity or Tribally chartered instrumentality designated by the Lumbee Tribe, and LREMC Technologies, LLC d/b/a RIVR Tech (“RIVR Tech”). It is a non-binding working draft prepared to frame the transaction, isolate open business issues, and drive the definitive documents. It does not create legal obligations, is not an offer, and is subject in all respects to legal, grant-compliance, and financial review. Defined terms used but not defined here have the meanings given in the definitive agreements.</w:t>
       </w:r>
     </w:p>
     <w:p/>
@@ -300,7 +300,7 @@
           <w:b w:val="0"/>
           <w:i w:val="0"/>
         </w:rPr>
-        <w:t>The Tribe intends to apply for, and if awarded to accept, funding under the Tribal Broadband Connectivity Program (TBCP) administered by the National Telecommunications and Information Administration (NTIA) under the TBCP Round 3 Notice of Funding Opportunity to deploy last-mile and distribution fiber broadband infrastructure serving unserved and underserved locations in southeastern North Carolina. The Tribe will be the grant recipient of record, the legal owner of all grant-funded infrastructure, and the entity accountable to NTIA for compliance with the Award. RIVR Tech will design, engineer, construct, activate, operate, maintain, and commercialize the resulting Network and will deliver residential, business, and enterprise broadband, voice, and related services.</w:t>
+        <w:t>The Lumbee Tribe intends to apply for, and if awarded to accept, funding under the Tribal Broadband Connectivity Program (TBCP) administered by the National Telecommunications and Information Administration (NTIA) under the TBCP Round 3 Notice of Funding Opportunity to deploy last-mile and distribution fiber broadband infrastructure serving unserved and underserved locations in southeastern North Carolina. The Lumbee Tribe will be the grant recipient of record, the legal owner of all grant-funded infrastructure, and the entity accountable to NTIA for compliance with the Award. RIVR Tech will design, engineer, construct, activate, operate, maintain, and commercialize the resulting Network and will deliver residential, business, and enterprise broadband, voice, and related services.</w:t>
       </w:r>
     </w:p>
     <w:p>
@@ -324,7 +324,7 @@
           <w:b w:val="0"/>
           <w:i w:val="0"/>
         </w:rPr>
-        <w:t>The transaction is structured as a public-private partnership in which grant-funded assets are owned by the Tribe and interconnected with RIVR Tech’s existing middle-mile, backbone, and core network. The Tribe retains title to the Tribal Assets at all times; RIVR Tech receives a long-term IRU (IRU) to operate and commercialize the Tribal Assets in exchange for assuming construction delivery, operating and maintenance obligations, capital-at-risk, grant-compliance performance support, and revenue sharing back to the Tribe. Title never transfers to RIVR Tech.</w:t>
+        <w:t>The transaction is structured as a public-private partnership in which grant-funded assets are owned by the Lumbee Tribe and interconnected with RIVR Tech’s existing middle-mile, backbone, and core network. The Lumbee Tribe retains title to the Tribal Assets at all times; RIVR Tech receives a long-term IRU (IRU) to operate and commercialize the Tribal Assets in exchange for assuming construction delivery, operating and maintenance obligations, capital-at-risk, grant-compliance performance support, and revenue sharing back to the Lumbee Tribe. Title never transfers to RIVR Tech.</w:t>
       </w:r>
     </w:p>
     <w:p>
@@ -384,7 +384,7 @@
           <w:b w:val="0"/>
           <w:i w:val="0"/>
         </w:rPr>
-        <w:t>The ownership-plus-IRU model lets the Tribe satisfy the TBCP requirement that grant assets be owned and controlled by the Tribal government while transferring operational execution and commercial risk to an experienced operator that already owns adjacent middle-mile facilities. It preserves Tribal sovereignty and long-term asset value, accelerates deployment, and avoids the Tribe having to stand up a full telecommunications operating company. It also keeps the Federal Interest cleanly identifiable, which is essential for NTIA reporting, audit, and disposition.</w:t>
+        <w:t>The ownership-plus-IRU model lets the Lumbee Tribe satisfy the TBCP requirement that grant assets be owned and controlled by the Tribal government while transferring operational execution and commercial risk to an experienced operator that already owns adjacent middle-mile facilities. It preserves Tribal sovereignty and long-term asset value, accelerates deployment, and avoids the Lumbee Tribe having to stand up a full telecommunications operating company. It also keeps the Federal Interest cleanly identifiable, which is essential for NTIA reporting, audit, and disposition.</w:t>
       </w:r>
     </w:p>
     <w:p/>
@@ -413,7 +413,7 @@
           <w:i/>
           <w:color w:val="595959"/>
         </w:rPr>
-        <w:t>The Tribe’s status under the Lumbee Act of 1956, Pub. L. 84-570, 70 Stat. 254 (federal-recognition status affecting TBCP eligibility) directly affects whether the Tribe qualifies as a “Tribal Government” eligible for TBCP funding. The Lumbee Act granted federal recognition of the Lumbee as Indians but has been historically construed to withhold eligibility for certain federal Indian programs and services. Whether the Tribe (or a designated Tribal entity) meets the TBCP definition of an eligible entity is a gating question that determines whether this transaction can proceed at all.</w:t>
+        <w:t>The Lumbee Tribe’s status under the Lumbee Act of 1956, Pub. L. 84-570, 70 Stat. 254 (federal-recognition status affecting TBCP eligibility) directly affects whether the Lumbee Tribe qualifies as a “Tribal Government” eligible for TBCP funding. The Lumbee Act granted federal recognition of the Lumbee as Indians but has been historically construed to withhold eligibility for certain federal Indian programs and services. Whether the Lumbee Tribe (or a designated Tribal entity) meets the TBCP definition of an eligible entity is a gating question that determines whether this transaction can proceed at all.</w:t>
       </w:r>
     </w:p>
     <w:p>
@@ -432,7 +432,7 @@
           <w:i/>
           <w:color w:val="595959"/>
         </w:rPr>
-        <w:t>Eligibility counsel and grant counsel must confirm, in writing and before any application is filed, the eligibility basis on which the Tribe will apply (e.g., statutory recognition, applicable NTIA guidance, or an alternative eligible applicant/co-applicant structure). This Summary does not resolve the question and assumes, solely for drafting purposes, that eligibility is or will be established. All downstream provisions are contingent on that confirmation. [■ eligibility determination basis and supporting opinion].</w:t>
+        <w:t>Eligibility counsel and grant counsel must confirm, in writing and before any application is filed, the eligibility basis on which the Lumbee Tribe will apply (e.g., statutory recognition, applicable NTIA guidance, or an alternative eligible applicant/co-applicant structure). This Summary does not resolve the question and assumes, solely for drafting purposes, that eligibility is or will be established. All downstream provisions are contingent on that confirmation. [■ eligibility determination basis and supporting opinion].</w:t>
       </w:r>
     </w:p>
     <w:p>
@@ -483,7 +483,7 @@
           <w:b w:val="0"/>
           <w:i w:val="0"/>
         </w:rPr>
-        <w:t>For the Tribe: durable Tribally owned infrastructure, digital equity for members, revenue to the Tribal government, reserved capacity for Tribal use, and full compliance with the Award.</w:t>
+        <w:t>For the Lumbee Tribe: durable Tribally owned infrastructure, digital equity for members, revenue to the Tribal government, reserved capacity for Tribal use, and full compliance with the Award.</w:t>
       </w:r>
     </w:p>
     <w:p>
@@ -531,7 +531,7 @@
           <w:b w:val="0"/>
           <w:i w:val="0"/>
         </w:rPr>
-        <w:t>Tribal ownership and sovereignty are preserved; title to Tribal Assets never leaves the Tribe.</w:t>
+        <w:t>Tribal ownership and sovereignty are preserved; title to Tribal Assets never leaves the Lumbee Tribe.</w:t>
       </w:r>
     </w:p>
     <w:p>
@@ -793,7 +793,7 @@
                 <w:i w:val="0"/>
                 <w:sz w:val="18"/>
               </w:rPr>
-              <w:t>Tribe grants; RIVR Tech holds</w:t>
+              <w:t>Lumbee Tribe grants; RIVR Tech holds</w:t>
             </w:r>
           </w:p>
         </w:tc>
@@ -1069,7 +1069,7 @@
           <w:b w:val="0"/>
           <w:i w:val="0"/>
         </w:rPr>
-        <w:t>Alternative 2 — Tribe self-operates the entire Network. Rejected (for now): requires the Tribe to build full telecom operating capability and bear operating risk; slower to market. Retained as a fallback through step-in and transition rights (Article 18).</w:t>
+        <w:t>Alternative 2 — Lumbee Tribe self-operates the entire Network. Rejected (for now): requires the Lumbee Tribe to build full telecom operating capability and bear operating risk; slower to market. Retained as a fallback through step-in and transition rights (Article 18).</w:t>
       </w:r>
     </w:p>
     <w:p>
@@ -1093,7 +1093,7 @@
           <w:color w:val="1F3864"/>
           <w:sz w:val="26"/>
         </w:rPr>
-        <w:t>ARTICLE 4.  ROLES OF THE TRIBE AND RIVR TECH</w:t>
+        <w:t>ARTICLE 4.  ROLES OF THE LUMBEE TRIBE AND RIVR TECH</w:t>
       </w:r>
     </w:p>
     <w:p>
@@ -1108,7 +1108,7 @@
           <w:color w:val="000000"/>
           <w:sz w:val="22"/>
         </w:rPr>
-        <w:t>4.1  Role of the Tribe</w:t>
+        <w:t>4.1  Role of the Lumbee Tribe</w:t>
       </w:r>
     </w:p>
     <w:p>
@@ -1117,7 +1117,7 @@
           <w:b w:val="0"/>
           <w:i w:val="0"/>
         </w:rPr>
-        <w:t>The Tribe acts as grant recipient, asset owner, and compliance principal.</w:t>
+        <w:t>The Lumbee Tribe acts as grant recipient, asset owner, and compliance principal.</w:t>
       </w:r>
     </w:p>
     <w:p>
@@ -1261,7 +1261,7 @@
           <w:b w:val="0"/>
           <w:i w:val="0"/>
         </w:rPr>
-        <w:t>Supports the Tribe’s grant-compliance, BABA, environmental/historic, reporting, and audit obligations by supplying data and certifications.</w:t>
+        <w:t>Supports the Lumbee Tribe’s grant-compliance, BABA, environmental/historic, reporting, and audit obligations by supplying data and certifications.</w:t>
       </w:r>
     </w:p>
     <w:p>
@@ -1273,7 +1273,7 @@
           <w:b w:val="0"/>
           <w:i w:val="0"/>
         </w:rPr>
-        <w:t>Pays the agreed consideration and revenue share to the Tribe.</w:t>
+        <w:t>Pays the agreed consideration and revenue share to the Lumbee Tribe.</w:t>
       </w:r>
     </w:p>
     <w:p>
@@ -1458,7 +1458,7 @@
                 <w:i w:val="0"/>
                 <w:sz w:val="18"/>
               </w:rPr>
-              <w:t>Tribe</w:t>
+              <w:t>Lumbee Tribe</w:t>
             </w:r>
           </w:p>
         </w:tc>
@@ -1724,7 +1724,7 @@
           <w:b w:val="0"/>
           <w:i w:val="0"/>
         </w:rPr>
-        <w:t>Title to the Tribal Assets vests in the Tribe upon acquisition/installation and remains with the Tribe. The IRU is a right of use, not a conveyance of title. Any encumbrance, lien, sale, or disposition of Tribal Assets is subject to 2 CFR 200.311 (Real property — use, encumbrance, and disposition) and 2 CFR 200.313 (Equipment — use, management, and disposition) and requires NTIA approval during the Federal-Interest period.</w:t>
+        <w:t>Title to the Tribal Assets vests in the Lumbee Tribe upon acquisition/installation and remains with the Lumbee Tribe. The IRU is a right of use, not a conveyance of title. Any encumbrance, lien, sale, or disposition of Tribal Assets is subject to 2 CFR 200.311 (Real property — use, encumbrance, and disposition) and 2 CFR 200.313 (Equipment — use, management, and disposition) and requires NTIA approval during the Federal-Interest period.</w:t>
       </w:r>
     </w:p>
     <w:p>
@@ -1782,7 +1782,7 @@
           <w:b w:val="0"/>
           <w:i w:val="0"/>
         </w:rPr>
-        <w:t>The Tribe grants RIVR Tech an indefeasible right to use, operate, manage, and commercialize the Tribal Assets and the resulting Network for the IRU term, subject to the Tribe’s retained title, reserved capacity, and the Award. The IRU is exclusive as to commercial operation but subject to the Tribe’s reserved fiber and government-use rights (Article 15) and to step-in rights (Article 18).</w:t>
+        <w:t>The Lumbee Tribe grants RIVR Tech an indefeasible right to use, operate, manage, and commercialize the Tribal Assets and the resulting Network for the IRU term, subject to the Lumbee Tribe’s retained title, reserved capacity, and the Award. The IRU is exclusive as to commercial operation but subject to the Lumbee Tribe’s reserved fiber and government-use rights (Article 15) and to step-in rights (Article 18).</w:t>
       </w:r>
     </w:p>
     <w:p>
@@ -2131,7 +2131,7 @@
           <w:b/>
           <w:i w:val="0"/>
         </w:rPr>
-        <w:t>Recommendation: adopt a 30-year initial term with two (2) renewal terms of ten (10) years each. A 30-year term best matches the physical and economic life of fiber plant, secures RIVR Tech’s long-term investment, and lowers the return the operator must charge — improving the revenue share available to the Tribe — while renewals and step-in rights preserve Tribal control.</w:t>
+        <w:t>Recommendation: adopt a 30-year initial term with two (2) renewal terms of ten (10) years each. A 30-year term best matches the physical and economic life of fiber plant, secures RIVR Tech’s long-term investment, and lowers the return the operator must charge — improving the revenue share available to the Lumbee Tribe — while renewals and step-in rights preserve Tribal control.</w:t>
       </w:r>
     </w:p>
     <w:p>
@@ -2174,7 +2174,7 @@
           <w:i/>
           <w:color w:val="595959"/>
         </w:rPr>
-        <w:t>Whether any up-front IRU payment is made to the Tribe at closing, and its amount, is an open commercial term. [■ up-front IRU payment, if any].</w:t>
+        <w:t>Whether any up-front IRU payment is made to the Lumbee Tribe at closing, and its amount, is an open commercial term. [■ up-front IRU payment, if any].</w:t>
       </w:r>
     </w:p>
     <w:p>
@@ -2551,7 +2551,7 @@
           <w:b w:val="0"/>
           <w:i w:val="0"/>
         </w:rPr>
-        <w:t>RIVR Tech delivers the Grant-Funded Infrastructure under a design-build model: final engineering, procurement, construction, splicing, testing, and activation, to an agreed scope, schedule, and acceptance standard. Assets are built to the Tribe’s account and titled to the Tribe as installed.</w:t>
+        <w:t>RIVR Tech delivers the Grant-Funded Infrastructure under a design-build model: final engineering, procurement, construction, splicing, testing, and activation, to an agreed scope, schedule, and acceptance standard. Assets are built to the Lumbee Tribe’s account and titled to the Lumbee Tribe as installed.</w:t>
       </w:r>
     </w:p>
     <w:p>
@@ -2647,7 +2647,7 @@
           <w:b w:val="0"/>
           <w:i w:val="0"/>
         </w:rPr>
-        <w:t>Construction may not begin on affected segments until required environmental and historic-preservation review is complete: National Environmental Policy Act (NEPA), 42 U.S.C. § 4321 et seq., and DOC/NTIA implementing procedures and National Historic Preservation Act § 106, 54 U.S.C. § 306108 (36 CFR Part 800). The Tribe (as recipient) is responsible to NTIA; RIVR Tech supports the reviews and honors any conditions, including Tribal Historic Preservation consultation.</w:t>
+        <w:t>Construction may not begin on affected segments until required environmental and historic-preservation review is complete: National Environmental Policy Act (NEPA), 42 U.S.C. § 4321 et seq., and DOC/NTIA implementing procedures and National Historic Preservation Act § 106, 54 U.S.C. § 306108 (36 CFR Part 800). The Lumbee Tribe (as recipient) is responsible to NTIA; RIVR Tech supports the reviews and honors any conditions, including Tribal Historic Preservation consultation.</w:t>
       </w:r>
     </w:p>
     <w:p>
@@ -2753,7 +2753,7 @@
           <w:b w:val="0"/>
           <w:i w:val="0"/>
         </w:rPr>
-        <w:t>Customer data is handled under applicable privacy law, including CPNI (47 U.S.C. § 222 and 47 CFR §§ 64.2001–64.2011 (Customer Proprietary Network Information)); the Tribe receives aggregate reporting, not individual customer data, except as needed for Tribal-member programs it sponsors.</w:t>
+        <w:t>Customer data is handled under applicable privacy law, including CPNI (47 U.S.C. § 222 and 47 CFR §§ 64.2001–64.2011 (Customer Proprietary Network Information)); the Lumbee Tribe receives aggregate reporting, not individual customer data, except as needed for Tribal-member programs it sponsors.</w:t>
       </w:r>
     </w:p>
     <w:p>
@@ -2854,7 +2854,7 @@
           <w:b w:val="0"/>
           <w:i w:val="0"/>
         </w:rPr>
-        <w:t>RIVR Tech bills subscribers and collects all service revenue, bearing bad-debt and collection risk. Gross service revenue is booked by RIVR Tech and then shared with the Tribe per the elected revenue-share option (Article 11).</w:t>
+        <w:t>RIVR Tech bills subscribers and collects all service revenue, bearing bad-debt and collection risk. Gross service revenue is booked by RIVR Tech and then shared with the Lumbee Tribe per the elected revenue-share option (Article 11).</w:t>
       </w:r>
     </w:p>
     <w:p>
@@ -2921,7 +2921,7 @@
           <w:b w:val="0"/>
           <w:i w:val="0"/>
         </w:rPr>
-        <w:t>RIVR Tech maintains auditable revenue records and provides the Tribe with periodic statements and audit access sufficient to support NTIA reporting and single-audit requirements (2 CFR 200.334–200.337 (Record retention and access; three-year retention); 2 CFR Part 200, Subpart F (Audit Requirements; single-audit threshold $1,000,000)).</w:t>
+        <w:t>RIVR Tech maintains auditable revenue records and provides the Lumbee Tribe with periodic statements and audit access sufficient to support NTIA reporting and single-audit requirements (2 CFR 200.334–200.337 (Record retention and access; three-year retention); 2 CFR Part 200, Subpart F (Audit Requirements; single-audit threshold $1,000,000)).</w:t>
       </w:r>
     </w:p>
     <w:p>
@@ -2960,7 +2960,7 @@
           <w:b w:val="0"/>
           <w:i w:val="0"/>
         </w:rPr>
-        <w:t>Five revenue-sharing structures were modeled. Each shares upside with the Tribe differently and allocates revenue and cost risk differently between the Parties. All percentages and dollar figures below are placeholders for the Financial Model.</w:t>
+        <w:t>Five revenue-sharing structures were modeled. Each shares upside with the Lumbee Tribe differently and allocates revenue and cost risk differently between the Parties. All percentages and dollar figures below are placeholders for the Financial Model.</w:t>
       </w:r>
     </w:p>
     <w:tbl>
@@ -3034,7 +3034,7 @@
                 <w:color w:val="FFFFFF"/>
                 <w:sz w:val="16"/>
               </w:rPr>
-              <w:t>Tribe Bears</w:t>
+              <w:t>Lumbee Tribe Bears</w:t>
             </w:r>
           </w:p>
         </w:tc>
@@ -3108,7 +3108,7 @@
                 <w:i w:val="0"/>
                 <w:sz w:val="16"/>
               </w:rPr>
-              <w:t>Fixed annual payment to the Tribe (</w:t>
+              <w:t>Fixed annual payment to the Lumbee Tribe (</w:t>
             </w:r>
             <w:r>
               <w:rPr>
@@ -3174,7 +3174,7 @@
                 <w:i w:val="0"/>
                 <w:sz w:val="16"/>
               </w:rPr>
-              <w:t>Most predictable for the Tribe; no upside participation</w:t>
+              <w:t>Most predictable for the Lumbee Tribe; no upside participation</w:t>
             </w:r>
           </w:p>
         </w:tc>
@@ -3486,7 +3486,7 @@
                 <w:i w:val="0"/>
                 <w:sz w:val="16"/>
               </w:rPr>
-              <w:t>Floor for the Tribe plus upside; balances predictability and alignment</w:t>
+              <w:t>Floor for the Lumbee Tribe plus upside; balances predictability and alignment</w:t>
             </w:r>
           </w:p>
         </w:tc>
@@ -3613,7 +3613,7 @@
           <w:b w:val="0"/>
           <w:i w:val="0"/>
         </w:rPr>
-        <w:t>Recommendation: adopt Option D — Hybrid (Fixed Base Payment plus Revenue Share). Option D gives the Tribe a guaranteed annual floor (protecting the Tribal government against ramp and revenue volatility) while preserving meaningful upside participation as subscribership grows. It is more auditable than a pure cash-flow share (Option C), whose cost definitions invite dispute, and more equitable than a flat fixed payment (Option A), which strands Tribal upside. A modest early-year step (borrowing from Option E) can be layered into the base to accommodate the build/ramp period.</w:t>
+        <w:t>Recommendation: adopt Option D — Hybrid (Fixed Base Payment plus Revenue Share). Option D gives the Lumbee Tribe a guaranteed annual floor (protecting the Tribal government against ramp and revenue volatility) while preserving meaningful upside participation as subscribership grows. It is more auditable than a pure cash-flow share (Option C), whose cost definitions invite dispute, and more equitable than a flat fixed payment (Option A), which strands Tribal upside. A modest early-year step (borrowing from Option E) can be layered into the base to accommodate the build/ramp period.</w:t>
       </w:r>
     </w:p>
     <w:p>
@@ -4055,7 +4055,7 @@
           <w:b w:val="0"/>
           <w:i w:val="0"/>
         </w:rPr>
-        <w:t>Fiber plant is long-lived, but electronics, optics, and certain passive components require periodic replacement within the IRU term. Responsibility for replacement capital (capex) must be allocated so that the Tribe receives the Network in good condition at expiry and RIVR Tech has incentives to maintain and modernize.</w:t>
+        <w:t>Fiber plant is long-lived, but electronics, optics, and certain passive components require periodic replacement within the IRU term. Responsibility for replacement capital (capex) must be allocated so that the Lumbee Tribe receives the Network in good condition at expiry and RIVR Tech has incentives to maintain and modernize.</w:t>
       </w:r>
     </w:p>
     <w:p>
@@ -4156,7 +4156,7 @@
           <w:b w:val="0"/>
           <w:i w:val="0"/>
         </w:rPr>
-        <w:t>The Tribe is accountable to NTIA for the Award. Compliance duties are flowed down to RIVR Tech through the Grant-Compliance Rider so that the entity performing the work also performs the associated compliance and recordkeeping.</w:t>
+        <w:t>The Lumbee Tribe is accountable to NTIA for the Award. Compliance duties are flowed down to RIVR Tech through the Grant-Compliance Rider so that the entity performing the work also performs the associated compliance and recordkeeping.</w:t>
       </w:r>
     </w:p>
     <w:tbl>
@@ -4299,7 +4299,7 @@
                 <w:i w:val="0"/>
                 <w:sz w:val="16"/>
               </w:rPr>
-              <w:t>Tribe</w:t>
+              <w:t>Lumbee Tribe</w:t>
             </w:r>
           </w:p>
         </w:tc>
@@ -4451,7 +4451,7 @@
                 <w:i w:val="0"/>
                 <w:sz w:val="16"/>
               </w:rPr>
-              <w:t>Tribe</w:t>
+              <w:t>Lumbee Tribe</w:t>
             </w:r>
           </w:p>
         </w:tc>
@@ -4521,7 +4521,7 @@
                 <w:i w:val="0"/>
                 <w:sz w:val="16"/>
               </w:rPr>
-              <w:t>Tribe</w:t>
+              <w:t>Lumbee Tribe</w:t>
             </w:r>
           </w:p>
         </w:tc>
@@ -4571,7 +4571,7 @@
                 <w:i w:val="0"/>
                 <w:sz w:val="16"/>
               </w:rPr>
-              <w:t>Tribe</w:t>
+              <w:t>Lumbee Tribe</w:t>
             </w:r>
           </w:p>
         </w:tc>
@@ -4640,7 +4640,7 @@
                 <w:i w:val="0"/>
                 <w:sz w:val="16"/>
               </w:rPr>
-              <w:t>Tribe</w:t>
+              <w:t>Lumbee Tribe</w:t>
             </w:r>
           </w:p>
         </w:tc>
@@ -4707,7 +4707,7 @@
                 <w:i w:val="0"/>
                 <w:sz w:val="16"/>
               </w:rPr>
-              <w:t>Tribe</w:t>
+              <w:t>Lumbee Tribe</w:t>
             </w:r>
           </w:p>
         </w:tc>
@@ -4843,7 +4843,7 @@
                 <w:i w:val="0"/>
                 <w:sz w:val="16"/>
               </w:rPr>
-              <w:t>Tribe</w:t>
+              <w:t>Lumbee Tribe</w:t>
             </w:r>
           </w:p>
         </w:tc>
@@ -4912,7 +4912,7 @@
                 <w:i w:val="0"/>
                 <w:sz w:val="16"/>
               </w:rPr>
-              <w:t>Tribe</w:t>
+              <w:t>Lumbee Tribe</w:t>
             </w:r>
           </w:p>
         </w:tc>
@@ -4990,7 +4990,7 @@
           <w:b w:val="0"/>
           <w:i w:val="0"/>
         </w:rPr>
-        <w:t>The Tribe reserves, for its own governmental and community use, dedicated dark fiber strands and/or lit capacity on the Tribal Assets, at no recurring charge or at a cost-based rate, exempt from the commercial IRU. This reservation is carved out of RIVR Tech’s operating rights and survives assignment.</w:t>
+        <w:t>The Lumbee Tribe reserves, for its own governmental and community use, dedicated dark fiber strands and/or lit capacity on the Tribal Assets, at no recurring charge or at a cost-based rate, exempt from the commercial IRU. This reservation is carved out of RIVR Tech’s operating rights and survives assignment.</w:t>
       </w:r>
     </w:p>
     <w:p>
@@ -5329,7 +5329,7 @@
                 <w:i w:val="0"/>
                 <w:sz w:val="18"/>
               </w:rPr>
-              <w:t>Tribe</w:t>
+              <w:t>Lumbee Tribe</w:t>
             </w:r>
           </w:p>
         </w:tc>
@@ -5514,7 +5514,7 @@
           <w:b w:val="0"/>
           <w:i w:val="0"/>
         </w:rPr>
-        <w:t>On termination or expiry, operational control of the Tribal Assets returns to the Tribe (or its designee) in the required condition; the Tribe retains title throughout; and the Parties implement the transition plan (Article 18). Post-termination obligations, records access, and Program-Income true-up survive.</w:t>
+        <w:t>On termination or expiry, operational control of the Tribal Assets returns to the Lumbee Tribe (or its designee) in the required condition; the Lumbee Tribe retains title throughout; and the Parties implement the transition plan (Article 18). Post-termination obligations, records access, and Program-Income true-up survive.</w:t>
       </w:r>
     </w:p>
     <w:p>
@@ -5533,7 +5533,7 @@
           <w:i/>
           <w:color w:val="595959"/>
         </w:rPr>
-        <w:t>Termination triggers, cross-defaults among the definitive documents, and the consequences of a grant-driven termination (including whether it is a Tribe-side or Operator-side risk) must be tailored by counsel.</w:t>
+        <w:t>Termination triggers, cross-defaults among the definitive documents, and the consequences of a grant-driven termination (including whether it is a Lumbee Tribe-side or Operator-side risk) must be tailored by counsel.</w:t>
       </w:r>
     </w:p>
     <w:p>
@@ -5572,7 +5572,7 @@
           <w:b w:val="0"/>
           <w:i w:val="0"/>
         </w:rPr>
-        <w:t>To protect continuity of Essential Services and Award compliance, the Tribe (or its designee) may step in to operate or cause operation of the Network upon defined triggers, including RIVR Tech insolvency, abandonment, chronic SLA failure, or a compliance breach that imperils the Award. Emergency step-in is immediate, upon notice, where continuity of Essential Services, public safety, or compliance with the Award is imminently threatened.</w:t>
+        <w:t>To protect continuity of Essential Services and Award compliance, the Lumbee Tribe (or its designee) may step in to operate or cause operation of the Network upon defined triggers, including RIVR Tech insolvency, abandonment, chronic SLA failure, or a compliance breach that imperils the Award. Emergency step-in is immediate, upon notice, where continuity of Essential Services, public safety, or compliance with the Award is imminently threatened.</w:t>
       </w:r>
     </w:p>
     <w:p>
@@ -5596,7 +5596,7 @@
           <w:b w:val="0"/>
           <w:i w:val="0"/>
         </w:rPr>
-        <w:t>On expiry or termination, RIVR Tech provides transition assistance for up to 12 months: knowledge transfer, records, network documentation, key third-party assignments, and continuity of subscriber service, so the Tribe or a successor operator can assume operations without service interruption.</w:t>
+        <w:t>On expiry or termination, RIVR Tech provides transition assistance for up to 12 months: knowledge transfer, records, network documentation, key third-party assignments, and continuity of subscriber service, so the Lumbee Tribe or a successor operator can assume operations without service interruption.</w:t>
       </w:r>
     </w:p>
     <w:p>
@@ -5651,7 +5651,7 @@
           <w:i/>
           <w:color w:val="595959"/>
         </w:rPr>
-        <w:t>Step-in triggers, the scope of any limited sovereign-immunity considerations when the Tribe operates, subscriber-base ownership on transition, and lender step-in/cure rights must be reconciled by counsel.</w:t>
+        <w:t>Step-in triggers, the scope of any limited sovereign-immunity considerations when the Lumbee Tribe operates, subscriber-base ownership on transition, and lender step-in/cure rights must be reconciled by counsel.</w:t>
       </w:r>
     </w:p>
     <w:p>
@@ -5743,7 +5743,7 @@
           <w:b w:val="0"/>
           <w:i w:val="0"/>
         </w:rPr>
-        <w:t xml:space="preserve">Any up-front IRU payment to the Tribe. </w:t>
+        <w:t xml:space="preserve">Any up-front IRU payment to the Lumbee Tribe. </w:t>
       </w:r>
       <w:r>
         <w:rPr>
@@ -6022,7 +6022,7 @@
           <w:b w:val="0"/>
           <w:i w:val="0"/>
         </w:rPr>
-        <w:t>Exclusive commercial operating rights (subject only to the Tribe’s reserved capacity) to protect the subscriber investment.</w:t>
+        <w:t>Exclusive commercial operating rights (subject only to the Lumbee Tribe’s reserved capacity) to protect the subscriber investment.</w:t>
       </w:r>
     </w:p>
     <w:p>
@@ -6046,7 +6046,7 @@
           <w:b w:val="0"/>
           <w:i w:val="0"/>
         </w:rPr>
-        <w:t>Cap operator exposure for catastrophic restoration of Tribal Assets to insurance proceeds plus a defined amount; the balance funded by reserve or Tribe.</w:t>
+        <w:t>Cap operator exposure for catastrophic restoration of Tribal Assets to insurance proceeds plus a defined amount; the balance funded by reserve or Lumbee Tribe.</w:t>
       </w:r>
     </w:p>
     <w:p>
@@ -6113,7 +6113,7 @@
           <w:i/>
           <w:color w:val="595959"/>
         </w:rPr>
-        <w:t>These are one-sided starting positions for RIVR Tech; they are not legal advice to the Tribe and several depend on NTIA and grant-compliance constraints.</w:t>
+        <w:t>These are one-sided starting positions for RIVR Tech; they are not legal advice to the Lumbee Tribe and several depend on NTIA and grant-compliance constraints.</w:t>
       </w:r>
     </w:p>
     <w:p>
@@ -6128,7 +6128,7 @@
           <w:color w:val="1F3864"/>
           <w:sz w:val="26"/>
         </w:rPr>
-        <w:t>ARTICLE 21.  RECOMMENDED PROTECTIONS FOR THE TRIBE</w:t>
+        <w:t>ARTICLE 21.  RECOMMENDED PROTECTIONS FOR THE LUMBEE TRIBE</w:t>
       </w:r>
     </w:p>
     <w:p>
@@ -6137,7 +6137,7 @@
           <w:b w:val="0"/>
           <w:i w:val="0"/>
         </w:rPr>
-        <w:t>The following protections preserve the Tribe’s ownership, sovereignty, compliance posture, and long-term value. They are offered as safeguards the Tribe should seek.</w:t>
+        <w:t>The following protections preserve the Lumbee Tribe’s ownership, sovereignty, compliance posture, and long-term value. They are offered as safeguards the Lumbee Tribe should seek.</w:t>
       </w:r>
     </w:p>
     <w:p>
@@ -6209,7 +6209,7 @@
           <w:b w:val="0"/>
           <w:i w:val="0"/>
         </w:rPr>
-        <w:t>Full audit and records access; operator indemnity for compliance failures caused by the operator; insurance naming the Tribe as additional insured.</w:t>
+        <w:t>Full audit and records access; operator indemnity for compliance failures caused by the operator; insurance naming the Lumbee Tribe as additional insured.</w:t>
       </w:r>
     </w:p>
     <w:p>
@@ -6264,7 +6264,7 @@
           <w:i/>
           <w:color w:val="595959"/>
         </w:rPr>
-        <w:t>Sovereign-immunity scope, assignment/change-of-control controls, and lender accommodations must be tailored so Tribal protections and operator/lender needs are reconciled without waiving more than the Tribe intends.</w:t>
+        <w:t>Sovereign-immunity scope, assignment/change-of-control controls, and lender accommodations must be tailored so Tribal protections and operator/lender needs are reconciled without waiving more than the Lumbee Tribe intends.</w:t>
       </w:r>
     </w:p>
     <w:p>
@@ -6494,7 +6494,7 @@
           <w:b w:val="0"/>
           <w:i w:val="0"/>
         </w:rPr>
-        <w:t xml:space="preserve">[ALT-B: Tribal law of the Tribe and the jurisdiction of the Tribal court/forum.] </w:t>
+        <w:t xml:space="preserve">[ALT-B: Tribal law of the Lumbee Tribe and the jurisdiction of the Tribal court/forum.] </w:t>
       </w:r>
       <w:r>
         <w:rPr>
@@ -6565,7 +6565,7 @@
           <w:b w:val="0"/>
           <w:i w:val="0"/>
         </w:rPr>
-        <w:t>Whether and how the Tribe waives sovereign immunity is NOT decided here. Alternatives:</w:t>
+        <w:t>Whether and how the Lumbee Tribe waives sovereign immunity is NOT decided here. Alternatives:</w:t>
       </w:r>
     </w:p>
     <w:p>
@@ -6644,7 +6644,7 @@
           <w:i/>
           <w:color w:val="595959"/>
         </w:rPr>
-        <w:t>Any waiver must be authorized by the proper Tribal governing body per Tribal law, expressly limited, and never broader than necessary. This is a sovereign act of the Tribe, not a drafting default.</w:t>
+        <w:t>Any waiver must be authorized by the proper Tribal governing body per Tribal law, expressly limited, and never broader than necessary. This is a sovereign act of the Lumbee Tribe, not a drafting default.</w:t>
       </w:r>
     </w:p>
     <w:p>
@@ -6753,7 +6753,7 @@
                 <w:i w:val="0"/>
                 <w:sz w:val="16"/>
               </w:rPr>
-              <w:t>Lumbee Tribe of North Carolina (the “Tribe”), or a wholly owned Tribal entity or Tribally chartered instrumentality designated by the Tribe; and LREMC Technologies, LLC d/b/a RIVR Tech (“RIVR Tech”).</w:t>
+              <w:t>Lumbee Tribe of North Carolina (the “Lumbee Tribe”), or a wholly owned Tribal entity or Tribally chartered instrumentality designated by the Lumbee Tribe; and LREMC Technologies, LLC d/b/a RIVR Tech (“RIVR Tech”).</w:t>
             </w:r>
           </w:p>
         </w:tc>
@@ -6919,7 +6919,7 @@
                 <w:i w:val="0"/>
                 <w:sz w:val="16"/>
               </w:rPr>
-              <w:t>Tribe holds and retains title to all Tribal Assets; RIVR Tech owns RIVR Tech Assets. Boundary fixed by the Demarcation Point schedule.</w:t>
+              <w:t>Lumbee Tribe holds and retains title to all Tribal Assets; RIVR Tech owns RIVR Tech Assets. Boundary fixed by the Demarcation Point schedule.</w:t>
             </w:r>
           </w:p>
         </w:tc>
@@ -7368,7 +7368,7 @@
                 <w:i w:val="0"/>
                 <w:sz w:val="16"/>
               </w:rPr>
-              <w:t>For cause with cure: 30-day monetary / 60-day non-monetary; grant/compliance termination per 2 CFR 200.339–200.343 (Remedies for noncompliance; termination); title returns to Tribe.</w:t>
+              <w:t>For cause with cure: 30-day monetary / 60-day non-monetary; grant/compliance termination per 2 CFR 200.339–200.343 (Remedies for noncompliance; termination); title returns to Lumbee Tribe.</w:t>
             </w:r>
           </w:p>
         </w:tc>
@@ -7483,7 +7483,7 @@
                 <w:i w:val="0"/>
                 <w:sz w:val="16"/>
               </w:rPr>
-              <w:t>CGL $2,000,000/occurrence ($4,000,000 agg.); umbrella $10,000,000; cyber $5,000,000; builders risk full replacement cost of the Tribal Assets; Tribe as additional insured. (2 CFR 200.310 (Insurance coverage))</w:t>
+              <w:t>CGL $2,000,000/occurrence ($4,000,000 agg.); umbrella $10,000,000; cyber $5,000,000; builders risk full replacement cost of the Tribal Assets; Lumbee Tribe as additional insured. (2 CFR 200.310 (Insurance coverage))</w:t>
             </w:r>
           </w:p>
         </w:tc>
@@ -7712,7 +7712,7 @@
                 <w:color w:val="FFFFFF"/>
                 <w:sz w:val="16"/>
               </w:rPr>
-              <w:t>Tribe</w:t>
+              <w:t>Lumbee Tribe</w:t>
             </w:r>
           </w:p>
         </w:tc>
@@ -9951,7 +9951,7 @@
           <w:i/>
           <w:color w:val="595959"/>
         </w:rPr>
-        <w:t>Signature authority for the Tribe requires proper Tribal Council authorization; signature authority for RIVR Tech requires corporate authorization. Confirm both before execution.</w:t>
+        <w:t>Signature authority for the Lumbee Tribe requires proper Tribal Council authorization; signature authority for RIVR Tech requires corporate authorization. Confirm both before execution.</w:t>
       </w:r>
     </w:p>
     <w:sectPr>

</xml_diff>